<commit_message>
Update alignment data and visualization assets for 2026-08-24 release
</commit_message>
<xml_diff>
--- a/eng/docx/07.content.docx
+++ b/eng/docx/07.content.docx
@@ -529,7 +529,7 @@
         <w:rPr>
           <w:lang w:val="en_US" w:bidi="en_US"/>
         </w:rPr>
-        <w:t xml:space="preserve"> The father-in-law of Moses was a Kenite. Some of his descendants had been living in the area of Jericho, which people called Palm Tree City. They went with some people from the tribe of Judah to the wilderness {in the southern part} of the territory that belonged to that tribe. They settled with those Judeans in the dry region that is around the city of Arad.</w:t>
+        <w:t xml:space="preserve"> The father-in-law of Moses was a Kenite. Some of his descendants had been living in the area of Jericho, which people called the City of Palms. They went with some people from the tribe of Judah to the wilderness {in the southern part} of the territory that belonged to that tribe. They settled with those Judeans in the dry region that is around the city of Arad.</w:t>
       </w:r>
     </w:p>
     <w:p>
@@ -1695,7 +1695,7 @@
         <w:rPr>
           <w:lang w:val="en_US" w:bidi="en_US"/>
         </w:rPr>
-        <w:t xml:space="preserve"> Eglon persuaded the leaders of the Ammonites and the Amalekites to join their armies with his army to attack Israel. They defeated the Israelites and captured Jericho, which people called Palm Tree City.</w:t>
+        <w:t xml:space="preserve"> Eglon persuaded the leaders of the Ammonites and the Amalekites to join their armies with his army to attack Israel. They defeated the Israelites and captured Jericho, which people called the City of Palms.</w:t>
       </w:r>
     </w:p>
     <w:p>

</xml_diff>